<commit_message>
Update pipeline to fix order of operator extensions
</commit_message>
<xml_diff>
--- a/data/input/mock_reglas.docx
+++ b/data/input/mock_reglas.docx
@@ -199,6 +199,342 @@
           <w:p>
             <w:r>
               <w:t>Sector controlado.</w:t>
+            </w:r>
+          </w:p>
+        </w:tc>
+      </w:tr>
+      <w:tr>
+        <w:tc>
+          <w:tcPr>
+            <w:tcW w:type="dxa" w:w="2160"/>
+          </w:tcPr>
+          <w:p>
+            <w:r>
+              <w:t>Operador calificado</w:t>
+            </w:r>
+          </w:p>
+        </w:tc>
+        <w:tc>
+          <w:tcPr>
+            <w:tcW w:type="dxa" w:w="2160"/>
+          </w:tcPr>
+          <w:p>
+            <w:r>
+              <w:t>operador autorizado</w:t>
+            </w:r>
+          </w:p>
+        </w:tc>
+        <w:tc>
+          <w:tcPr>
+            <w:tcW w:type="dxa" w:w="2160"/>
+          </w:tcPr>
+          <w:p>
+            <w:r>
+              <w:t>El operador autorizado debe ejecutar el bloqueo local antes de intervenir el panel de control.</w:t>
+            </w:r>
+          </w:p>
+        </w:tc>
+        <w:tc>
+          <w:tcPr>
+            <w:tcW w:type="dxa" w:w="2160"/>
+          </w:tcPr>
+          <w:p>
+            <w:r>
+              <w:t>Debe usar personal calificado.</w:t>
+            </w:r>
+          </w:p>
+        </w:tc>
+      </w:tr>
+      <w:tr>
+        <w:tc>
+          <w:tcPr>
+            <w:tcW w:type="dxa" w:w="2160"/>
+          </w:tcPr>
+          <w:p>
+            <w:r>
+              <w:t>Especialidad larga</w:t>
+            </w:r>
+          </w:p>
+        </w:tc>
+        <w:tc>
+          <w:tcPr>
+            <w:tcW w:type="dxa" w:w="2160"/>
+          </w:tcPr>
+          <w:p>
+            <w:r>
+              <w:t>operador de Apilador</w:t>
+            </w:r>
+          </w:p>
+        </w:tc>
+        <w:tc>
+          <w:tcPr>
+            <w:tcW w:type="dxa" w:w="2160"/>
+          </w:tcPr>
+          <w:p>
+            <w:r>
+              <w:t>El operador de Apilador debe detener la correa afectada y comunicar la desviacion.</w:t>
+            </w:r>
+          </w:p>
+        </w:tc>
+        <w:tc>
+          <w:tcPr>
+            <w:tcW w:type="dxa" w:w="2160"/>
+          </w:tcPr>
+          <w:p>
+            <w:r>
+              <w:t>Descriptor preservado.</w:t>
+            </w:r>
+          </w:p>
+        </w:tc>
+      </w:tr>
+      <w:tr>
+        <w:tc>
+          <w:tcPr>
+            <w:tcW w:type="dxa" w:w="2160"/>
+          </w:tcPr>
+          <w:p>
+            <w:r>
+              <w:t>Equipo retroexcavadora</w:t>
+            </w:r>
+          </w:p>
+        </w:tc>
+        <w:tc>
+          <w:tcPr>
+            <w:tcW w:type="dxa" w:w="2160"/>
+          </w:tcPr>
+          <w:p>
+            <w:r>
+              <w:t>Operador retroexcavadora</w:t>
+            </w:r>
+          </w:p>
+        </w:tc>
+        <w:tc>
+          <w:tcPr>
+            <w:tcW w:type="dxa" w:w="2160"/>
+          </w:tcPr>
+          <w:p>
+            <w:r>
+              <w:t>El Operador retroexcavadora debe coordinar el retiro de material con el camion tolva.</w:t>
+            </w:r>
+          </w:p>
+        </w:tc>
+        <w:tc>
+          <w:tcPr>
+            <w:tcW w:type="dxa" w:w="2160"/>
+          </w:tcPr>
+          <w:p>
+            <w:r>
+              <w:t>Descriptor antes del target.</w:t>
+            </w:r>
+          </w:p>
+        </w:tc>
+      </w:tr>
+      <w:tr>
+        <w:tc>
+          <w:tcPr>
+            <w:tcW w:type="dxa" w:w="2160"/>
+          </w:tcPr>
+          <w:p>
+            <w:r>
+              <w:t>Equipo camion tolva</w:t>
+            </w:r>
+          </w:p>
+        </w:tc>
+        <w:tc>
+          <w:tcPr>
+            <w:tcW w:type="dxa" w:w="2160"/>
+          </w:tcPr>
+          <w:p>
+            <w:r>
+              <w:t>Operador de camion tolva</w:t>
+            </w:r>
+          </w:p>
+        </w:tc>
+        <w:tc>
+          <w:tcPr>
+            <w:tcW w:type="dxa" w:w="2160"/>
+          </w:tcPr>
+          <w:p>
+            <w:r>
+              <w:t>El Operador de camion tolva debe revisar el layout para cargar y descargar el mineral.</w:t>
+            </w:r>
+          </w:p>
+        </w:tc>
+        <w:tc>
+          <w:tcPr>
+            <w:tcW w:type="dxa" w:w="2160"/>
+          </w:tcPr>
+          <w:p>
+            <w:r>
+              <w:t>Descriptor compuesto preservado.</w:t>
+            </w:r>
+          </w:p>
+        </w:tc>
+      </w:tr>
+      <w:tr>
+        <w:tc>
+          <w:tcPr>
+            <w:tcW w:type="dxa" w:w="2160"/>
+          </w:tcPr>
+          <w:p>
+            <w:r>
+              <w:t>Equipo mini cargador</w:t>
+            </w:r>
+          </w:p>
+        </w:tc>
+        <w:tc>
+          <w:tcPr>
+            <w:tcW w:type="dxa" w:w="2160"/>
+          </w:tcPr>
+          <w:p>
+            <w:r>
+              <w:t>Operador mini cargador</w:t>
+            </w:r>
+          </w:p>
+        </w:tc>
+        <w:tc>
+          <w:tcPr>
+            <w:tcW w:type="dxa" w:w="2160"/>
+          </w:tcPr>
+          <w:p>
+            <w:r>
+              <w:t>El Operador mini cargador debe retirar material por los costados con la correa detenida.</w:t>
+            </w:r>
+          </w:p>
+        </w:tc>
+        <w:tc>
+          <w:tcPr>
+            <w:tcW w:type="dxa" w:w="2160"/>
+          </w:tcPr>
+          <w:p>
+            <w:r>
+              <w:t>Descriptor compuesto preservado.</w:t>
+            </w:r>
+          </w:p>
+        </w:tc>
+      </w:tr>
+      <w:tr>
+        <w:tc>
+          <w:tcPr>
+            <w:tcW w:type="dxa" w:w="2160"/>
+          </w:tcPr>
+          <w:p>
+            <w:r>
+              <w:t>Equipo rotopalas</w:t>
+            </w:r>
+          </w:p>
+        </w:tc>
+        <w:tc>
+          <w:tcPr>
+            <w:tcW w:type="dxa" w:w="2160"/>
+          </w:tcPr>
+          <w:p>
+            <w:r>
+              <w:t>operadores de Rotopalas</w:t>
+            </w:r>
+          </w:p>
+        </w:tc>
+        <w:tc>
+          <w:tcPr>
+            <w:tcW w:type="dxa" w:w="2160"/>
+          </w:tcPr>
+          <w:p>
+            <w:r>
+              <w:t>Los operadores de Rotopalas deben delimitar el area con conos y cadenas.</w:t>
+            </w:r>
+          </w:p>
+        </w:tc>
+        <w:tc>
+          <w:tcPr>
+            <w:tcW w:type="dxa" w:w="2160"/>
+          </w:tcPr>
+          <w:p>
+            <w:r>
+              <w:t>Plural preservado.</w:t>
+            </w:r>
+          </w:p>
+        </w:tc>
+      </w:tr>
+      <w:tr>
+        <w:tc>
+          <w:tcPr>
+            <w:tcW w:type="dxa" w:w="2160"/>
+          </w:tcPr>
+          <w:p>
+            <w:r>
+              <w:t>Equipos genericos</w:t>
+            </w:r>
+          </w:p>
+        </w:tc>
+        <w:tc>
+          <w:tcPr>
+            <w:tcW w:type="dxa" w:w="2160"/>
+          </w:tcPr>
+          <w:p>
+            <w:r>
+              <w:t>operadores de los equipos</w:t>
+            </w:r>
+          </w:p>
+        </w:tc>
+        <w:tc>
+          <w:tcPr>
+            <w:tcW w:type="dxa" w:w="2160"/>
+          </w:tcPr>
+          <w:p>
+            <w:r>
+              <w:t>Los operadores de los equipos deben informar el inicio de la maniobra.</w:t>
+            </w:r>
+          </w:p>
+        </w:tc>
+        <w:tc>
+          <w:tcPr>
+            <w:tcW w:type="dxa" w:w="2160"/>
+          </w:tcPr>
+          <w:p>
+            <w:r>
+              <w:t>Articulo preservado.</w:t>
+            </w:r>
+          </w:p>
+        </w:tc>
+      </w:tr>
+      <w:tr>
+        <w:tc>
+          <w:tcPr>
+            <w:tcW w:type="dxa" w:w="2160"/>
+          </w:tcPr>
+          <w:p>
+            <w:r>
+              <w:t>Formato genero</w:t>
+            </w:r>
+          </w:p>
+        </w:tc>
+        <w:tc>
+          <w:tcPr>
+            <w:tcW w:type="dxa" w:w="2160"/>
+          </w:tcPr>
+          <w:p>
+            <w:r>
+              <w:t>operador/a</w:t>
+            </w:r>
+          </w:p>
+        </w:tc>
+        <w:tc>
+          <w:tcPr>
+            <w:tcW w:type="dxa" w:w="2160"/>
+          </w:tcPr>
+          <w:p>
+            <w:r>
+              <w:t>El operador/a debe registrar la inspeccion final en el sistema.</w:t>
+            </w:r>
+          </w:p>
+        </w:tc>
+        <w:tc>
+          <w:tcPr>
+            <w:tcW w:type="dxa" w:w="2160"/>
+          </w:tcPr>
+          <w:p>
+            <w:r>
+              <w:t>Genero preservado.</w:t>
             </w:r>
           </w:p>
         </w:tc>
@@ -420,6 +756,48 @@
           </w:tcPr>
           <w:p>
             <w:r>
+              <w:t>Operador CAS exento</w:t>
+            </w:r>
+          </w:p>
+        </w:tc>
+        <w:tc>
+          <w:tcPr>
+            <w:tcW w:type="dxa" w:w="2160"/>
+          </w:tcPr>
+          <w:p>
+            <w:r>
+              <w:t>Operador CAS</w:t>
+            </w:r>
+          </w:p>
+        </w:tc>
+        <w:tc>
+          <w:tcPr>
+            <w:tcW w:type="dxa" w:w="2160"/>
+          </w:tcPr>
+          <w:p>
+            <w:r>
+              <w:t>El Operador CAS debe monitorear las variables desde sala de control.</w:t>
+            </w:r>
+          </w:p>
+        </w:tc>
+        <w:tc>
+          <w:tcPr>
+            <w:tcW w:type="dxa" w:w="2160"/>
+          </w:tcPr>
+          <w:p>
+            <w:r>
+              <w:t>Sin cambio por excepcion.</w:t>
+            </w:r>
+          </w:p>
+        </w:tc>
+      </w:tr>
+      <w:tr>
+        <w:tc>
+          <w:tcPr>
+            <w:tcW w:type="dxa" w:w="2160"/>
+          </w:tcPr>
+          <w:p>
+            <w:r>
               <w:t>Caso ya expandido</w:t>
             </w:r>
           </w:p>
@@ -615,6 +993,11 @@
     </w:p>
     <w:p>
       <w:r>
+        <w:t>El operador(a) capacitado debe realizar reset en HMI cuando el procedimiento lo autorice.</w:t>
+      </w:r>
+    </w:p>
+    <w:p>
+      <w:r>
         <w:t>La supervisora de turno revisa las condiciones generales antes de liberar el equipo.</w:t>
       </w:r>
     </w:p>
@@ -623,6 +1006,90 @@
         <w:t>El jefe de área debe validar que el permiso de trabajo este vigente.</w:t>
       </w:r>
     </w:p>
+    <w:p>
+      <w:pPr>
+        <w:pStyle w:val="Heading2"/>
+      </w:pPr>
+      <w:r>
+        <w:t>REGISTROS</w:t>
+      </w:r>
+    </w:p>
+    <w:tbl>
+      <w:tblPr>
+        <w:tblStyle w:val="TableGrid"/>
+        <w:tblW w:type="auto" w:w="0"/>
+        <w:tblLook w:firstColumn="1" w:firstRow="1" w:lastColumn="0" w:lastRow="0" w:noHBand="0" w:noVBand="1" w:val="04A0"/>
+      </w:tblPr>
+      <w:tblGrid>
+        <w:gridCol w:w="2880"/>
+        <w:gridCol w:w="2880"/>
+        <w:gridCol w:w="2880"/>
+      </w:tblGrid>
+      <w:tr>
+        <w:tc>
+          <w:tcPr>
+            <w:tcW w:type="dxa" w:w="2880"/>
+          </w:tcPr>
+          <w:p>
+            <w:r>
+              <w:t>Registro</w:t>
+            </w:r>
+          </w:p>
+        </w:tc>
+        <w:tc>
+          <w:tcPr>
+            <w:tcW w:type="dxa" w:w="2880"/>
+          </w:tcPr>
+          <w:p>
+            <w:r>
+              <w:t>Responsable</w:t>
+            </w:r>
+          </w:p>
+        </w:tc>
+        <w:tc>
+          <w:tcPr>
+            <w:tcW w:type="dxa" w:w="2880"/>
+          </w:tcPr>
+          <w:p>
+            <w:r>
+              <w:t>Nota</w:t>
+            </w:r>
+          </w:p>
+        </w:tc>
+      </w:tr>
+      <w:tr>
+        <w:tc>
+          <w:tcPr>
+            <w:tcW w:type="dxa" w:w="2880"/>
+          </w:tcPr>
+          <w:p>
+            <w:r>
+              <w:t>Checklist operacional</w:t>
+            </w:r>
+          </w:p>
+        </w:tc>
+        <w:tc>
+          <w:tcPr>
+            <w:tcW w:type="dxa" w:w="2880"/>
+          </w:tcPr>
+          <w:p>
+            <w:r>
+              <w:t>operador</w:t>
+            </w:r>
+          </w:p>
+        </w:tc>
+        <w:tc>
+          <w:tcPr>
+            <w:tcW w:type="dxa" w:w="2880"/>
+          </w:tcPr>
+          <w:p>
+            <w:r>
+              <w:t>El operador debe firmar el registro al cierre, pero esta seccion no se modifica.</w:t>
+            </w:r>
+          </w:p>
+        </w:tc>
+      </w:tr>
+    </w:tbl>
     <w:p>
       <w:pPr>
         <w:pStyle w:val="Heading2"/>

</xml_diff>

<commit_message>
Update prompts and scripts to apply expansion rules
</commit_message>
<xml_diff>
--- a/data/input/mock_reglas.docx
+++ b/data/input/mock_reglas.docx
@@ -324,7 +324,49 @@
           </w:tcPr>
           <w:p>
             <w:r>
-              <w:t>Descriptor antes del target.</w:t>
+              <w:t>Debe usar personal certificado designado.</w:t>
+            </w:r>
+          </w:p>
+        </w:tc>
+      </w:tr>
+      <w:tr>
+        <w:tc>
+          <w:tcPr>
+            <w:tcW w:type="dxa" w:w="2160"/>
+          </w:tcPr>
+          <w:p>
+            <w:r>
+              <w:t>Equipo excavadora</w:t>
+            </w:r>
+          </w:p>
+        </w:tc>
+        <w:tc>
+          <w:tcPr>
+            <w:tcW w:type="dxa" w:w="2160"/>
+          </w:tcPr>
+          <w:p>
+            <w:r>
+              <w:t>Operador de excavadora</w:t>
+            </w:r>
+          </w:p>
+        </w:tc>
+        <w:tc>
+          <w:tcPr>
+            <w:tcW w:type="dxa" w:w="2160"/>
+          </w:tcPr>
+          <w:p>
+            <w:r>
+              <w:t>El Operador de excavadora debe acercarse al punto de maniobra lentamente.</w:t>
+            </w:r>
+          </w:p>
+        </w:tc>
+        <w:tc>
+          <w:tcPr>
+            <w:tcW w:type="dxa" w:w="2160"/>
+          </w:tcPr>
+          <w:p>
+            <w:r>
+              <w:t>Debe usar personal certificado designado.</w:t>
             </w:r>
           </w:p>
         </w:tc>
@@ -366,7 +408,49 @@
           </w:tcPr>
           <w:p>
             <w:r>
-              <w:t>Descriptor compuesto preservado.</w:t>
+              <w:t>Debe usar personal certificado designado.</w:t>
+            </w:r>
+          </w:p>
+        </w:tc>
+      </w:tr>
+      <w:tr>
+        <w:tc>
+          <w:tcPr>
+            <w:tcW w:type="dxa" w:w="2160"/>
+          </w:tcPr>
+          <w:p>
+            <w:r>
+              <w:t>Equipo camion pluma</w:t>
+            </w:r>
+          </w:p>
+        </w:tc>
+        <w:tc>
+          <w:tcPr>
+            <w:tcW w:type="dxa" w:w="2160"/>
+          </w:tcPr>
+          <w:p>
+            <w:r>
+              <w:t>Operador del camion pluma</w:t>
+            </w:r>
+          </w:p>
+        </w:tc>
+        <w:tc>
+          <w:tcPr>
+            <w:tcW w:type="dxa" w:w="2160"/>
+          </w:tcPr>
+          <w:p>
+            <w:r>
+              <w:t>El Operador del camion pluma debe posicionarse fuera del radio de trabajo.</w:t>
+            </w:r>
+          </w:p>
+        </w:tc>
+        <w:tc>
+          <w:tcPr>
+            <w:tcW w:type="dxa" w:w="2160"/>
+          </w:tcPr>
+          <w:p>
+            <w:r>
+              <w:t>Debe usar personal certificado designado.</w:t>
             </w:r>
           </w:p>
         </w:tc>
@@ -408,7 +492,7 @@
           </w:tcPr>
           <w:p>
             <w:r>
-              <w:t>Descriptor compuesto preservado.</w:t>
+              <w:t>Debe usar personal certificado designado.</w:t>
             </w:r>
           </w:p>
         </w:tc>
@@ -450,7 +534,49 @@
           </w:tcPr>
           <w:p>
             <w:r>
-              <w:t>Plural preservado.</w:t>
+              <w:t>Debe usar personal certificado designado.</w:t>
+            </w:r>
+          </w:p>
+        </w:tc>
+      </w:tr>
+      <w:tr>
+        <w:tc>
+          <w:tcPr>
+            <w:tcW w:type="dxa" w:w="2160"/>
+          </w:tcPr>
+          <w:p>
+            <w:r>
+              <w:t>Equipo puente grua</w:t>
+            </w:r>
+          </w:p>
+        </w:tc>
+        <w:tc>
+          <w:tcPr>
+            <w:tcW w:type="dxa" w:w="2160"/>
+          </w:tcPr>
+          <w:p>
+            <w:r>
+              <w:t>Operador del puente grua</w:t>
+            </w:r>
+          </w:p>
+        </w:tc>
+        <w:tc>
+          <w:tcPr>
+            <w:tcW w:type="dxa" w:w="2160"/>
+          </w:tcPr>
+          <w:p>
+            <w:r>
+              <w:t>El Operador del puente grua debe trasladar la carga hasta la zona segura.</w:t>
+            </w:r>
+          </w:p>
+        </w:tc>
+        <w:tc>
+          <w:tcPr>
+            <w:tcW w:type="dxa" w:w="2160"/>
+          </w:tcPr>
+          <w:p>
+            <w:r>
+              <w:t>Debe usar personal certificado designado.</w:t>
             </w:r>
           </w:p>
         </w:tc>
@@ -714,6 +840,48 @@
           </w:tcPr>
           <w:p>
             <w:r>
+              <w:t>Supervisor legado experto tecnico</w:t>
+            </w:r>
+          </w:p>
+        </w:tc>
+        <w:tc>
+          <w:tcPr>
+            <w:tcW w:type="dxa" w:w="2160"/>
+          </w:tcPr>
+          <w:p>
+            <w:r>
+              <w:t>supervisor del area o experto tecnico</w:t>
+            </w:r>
+          </w:p>
+        </w:tc>
+        <w:tc>
+          <w:tcPr>
+            <w:tcW w:type="dxa" w:w="2160"/>
+          </w:tcPr>
+          <w:p>
+            <w:r>
+              <w:t>El supervisor del area o experto tecnico debe autorizar la continuidad operacional.</w:t>
+            </w:r>
+          </w:p>
+        </w:tc>
+        <w:tc>
+          <w:tcPr>
+            <w:tcW w:type="dxa" w:w="2160"/>
+          </w:tcPr>
+          <w:p>
+            <w:r>
+              <w:t>Debe quedar con Ejecutivos del Área.</w:t>
+            </w:r>
+          </w:p>
+        </w:tc>
+      </w:tr>
+      <w:tr>
+        <w:tc>
+          <w:tcPr>
+            <w:tcW w:type="dxa" w:w="2160"/>
+          </w:tcPr>
+          <w:p>
+            <w:r>
               <w:t>Supervisor exento</w:t>
             </w:r>
           </w:p>
@@ -829,6 +997,48 @@
           <w:p>
             <w:r>
               <w:t>Sin duplicados.</w:t>
+            </w:r>
+          </w:p>
+        </w:tc>
+      </w:tr>
+      <w:tr>
+        <w:tc>
+          <w:tcPr>
+            <w:tcW w:type="dxa" w:w="2160"/>
+          </w:tcPr>
+          <w:p>
+            <w:r>
+              <w:t>Operador equipo con target antiguo</w:t>
+            </w:r>
+          </w:p>
+        </w:tc>
+        <w:tc>
+          <w:tcPr>
+            <w:tcW w:type="dxa" w:w="2160"/>
+          </w:tcPr>
+          <w:p>
+            <w:r>
+              <w:t>Operador de excavadora o personal designado por minera Spence</w:t>
+            </w:r>
+          </w:p>
+        </w:tc>
+        <w:tc>
+          <w:tcPr>
+            <w:tcW w:type="dxa" w:w="2160"/>
+          </w:tcPr>
+          <w:p>
+            <w:r>
+              <w:t>El Operador de excavadora o personal designado por minera Spence debe trasladar el equipo hacia la zona definida.</w:t>
+            </w:r>
+          </w:p>
+        </w:tc>
+        <w:tc>
+          <w:tcPr>
+            <w:tcW w:type="dxa" w:w="2160"/>
+          </w:tcPr>
+          <w:p>
+            <w:r>
+              <w:t>Debe actualizarse a personal certificado designado.</w:t>
             </w:r>
           </w:p>
         </w:tc>

</xml_diff>

<commit_message>
Update modules to address occurrences of supervisor charge in cells
</commit_message>
<xml_diff>
--- a/data/input/mock_reglas.docx
+++ b/data/input/mock_reglas.docx
@@ -798,6 +798,510 @@
           </w:tcPr>
           <w:p>
             <w:r>
+              <w:t>Tabla operador Spence</w:t>
+            </w:r>
+          </w:p>
+        </w:tc>
+        <w:tc>
+          <w:tcPr>
+            <w:tcW w:type="dxa" w:w="2160"/>
+          </w:tcPr>
+          <w:p>
+            <w:r>
+              <w:t>Operador Spence</w:t>
+            </w:r>
+          </w:p>
+        </w:tc>
+        <w:tc>
+          <w:tcPr>
+            <w:tcW w:type="dxa" w:w="2160"/>
+          </w:tcPr>
+          <w:p>
+            <w:r>
+              <w:t>El Operador Spence debe retirar el equipo desde el area asignada.</w:t>
+            </w:r>
+          </w:p>
+        </w:tc>
+        <w:tc>
+          <w:tcPr>
+            <w:tcW w:type="dxa" w:w="2160"/>
+          </w:tcPr>
+          <w:p>
+            <w:r>
+              <w:t>Sin duplicar Spence.</w:t>
+            </w:r>
+          </w:p>
+        </w:tc>
+      </w:tr>
+      <w:tr>
+        <w:tc>
+          <w:tcPr>
+            <w:tcW w:type="dxa" w:w="2160"/>
+          </w:tcPr>
+          <w:p>
+            <w:r>
+              <w:t>Tabla operador certificado</w:t>
+            </w:r>
+          </w:p>
+        </w:tc>
+        <w:tc>
+          <w:tcPr>
+            <w:tcW w:type="dxa" w:w="2160"/>
+          </w:tcPr>
+          <w:p>
+            <w:r>
+              <w:t>Operador Spence debidamente certificado</w:t>
+            </w:r>
+          </w:p>
+        </w:tc>
+        <w:tc>
+          <w:tcPr>
+            <w:tcW w:type="dxa" w:w="2160"/>
+          </w:tcPr>
+          <w:p>
+            <w:r>
+              <w:t>El Operador Spence debidamente certificado en operacion de puente grua debe ejecutar la maniobra.</w:t>
+            </w:r>
+          </w:p>
+        </w:tc>
+        <w:tc>
+          <w:tcPr>
+            <w:tcW w:type="dxa" w:w="2160"/>
+          </w:tcPr>
+          <w:p>
+            <w:r>
+              <w:t>Debe usar personal certificado designado.</w:t>
+            </w:r>
+          </w:p>
+        </w:tc>
+      </w:tr>
+      <w:tr>
+        <w:tc>
+          <w:tcPr>
+            <w:tcW w:type="dxa" w:w="2160"/>
+          </w:tcPr>
+          <w:p>
+            <w:r>
+              <w:t>Tabla patio catodos</w:t>
+            </w:r>
+          </w:p>
+        </w:tc>
+        <w:tc>
+          <w:tcPr>
+            <w:tcW w:type="dxa" w:w="2160"/>
+          </w:tcPr>
+          <w:p>
+            <w:r>
+              <w:t>operador de patio de catodos</w:t>
+            </w:r>
+          </w:p>
+        </w:tc>
+        <w:tc>
+          <w:tcPr>
+            <w:tcW w:type="dxa" w:w="2160"/>
+          </w:tcPr>
+          <w:p>
+            <w:r>
+              <w:t>El operador de patio de catodos debe verificar el orden de las placas antes del traslado.</w:t>
+            </w:r>
+          </w:p>
+        </w:tc>
+        <w:tc>
+          <w:tcPr>
+            <w:tcW w:type="dxa" w:w="2160"/>
+          </w:tcPr>
+          <w:p>
+            <w:r>
+              <w:t>Descriptor completo antes del target.</w:t>
+            </w:r>
+          </w:p>
+        </w:tc>
+      </w:tr>
+      <w:tr>
+        <w:tc>
+          <w:tcPr>
+            <w:tcW w:type="dxa" w:w="2160"/>
+          </w:tcPr>
+          <w:p>
+            <w:r>
+              <w:t>Tabla patio embarque</w:t>
+            </w:r>
+          </w:p>
+        </w:tc>
+        <w:tc>
+          <w:tcPr>
+            <w:tcW w:type="dxa" w:w="2160"/>
+          </w:tcPr>
+          <w:p>
+            <w:r>
+              <w:t>Operador de Patio embarque</w:t>
+            </w:r>
+          </w:p>
+        </w:tc>
+        <w:tc>
+          <w:tcPr>
+            <w:tcW w:type="dxa" w:w="2160"/>
+          </w:tcPr>
+          <w:p>
+            <w:r>
+              <w:t>El Operador de Patio embarque debe registrar el despacho en el sistema.</w:t>
+            </w:r>
+          </w:p>
+        </w:tc>
+        <w:tc>
+          <w:tcPr>
+            <w:tcW w:type="dxa" w:w="2160"/>
+          </w:tcPr>
+          <w:p>
+            <w:r>
+              <w:t>Descriptor embarque preservado.</w:t>
+            </w:r>
+          </w:p>
+        </w:tc>
+      </w:tr>
+      <w:tr>
+        <w:tc>
+          <w:tcPr>
+            <w:tcW w:type="dxa" w:w="2160"/>
+          </w:tcPr>
+          <w:p>
+            <w:r>
+              <w:t>Tabla otras areas</w:t>
+            </w:r>
+          </w:p>
+        </w:tc>
+        <w:tc>
+          <w:tcPr>
+            <w:tcW w:type="dxa" w:w="2160"/>
+          </w:tcPr>
+          <w:p>
+            <w:r>
+              <w:t>operadores de otras areas</w:t>
+            </w:r>
+          </w:p>
+        </w:tc>
+        <w:tc>
+          <w:tcPr>
+            <w:tcW w:type="dxa" w:w="2160"/>
+          </w:tcPr>
+          <w:p>
+            <w:r>
+              <w:t>Los operadores de otras areas deben coordinar la entrega con operaciones.</w:t>
+            </w:r>
+          </w:p>
+        </w:tc>
+        <w:tc>
+          <w:tcPr>
+            <w:tcW w:type="dxa" w:w="2160"/>
+          </w:tcPr>
+          <w:p>
+            <w:r>
+              <w:t>Descriptor otras areas preservado.</w:t>
+            </w:r>
+          </w:p>
+        </w:tc>
+      </w:tr>
+      <w:tr>
+        <w:tc>
+          <w:tcPr>
+            <w:tcW w:type="dxa" w:w="2160"/>
+          </w:tcPr>
+          <w:p>
+            <w:r>
+              <w:t>Tabla EW</w:t>
+            </w:r>
+          </w:p>
+        </w:tc>
+        <w:tc>
+          <w:tcPr>
+            <w:tcW w:type="dxa" w:w="2160"/>
+          </w:tcPr>
+          <w:p>
+            <w:r>
+              <w:t>Operador EW</w:t>
+            </w:r>
+          </w:p>
+        </w:tc>
+        <w:tc>
+          <w:tcPr>
+            <w:tcW w:type="dxa" w:w="2160"/>
+          </w:tcPr>
+          <w:p>
+            <w:r>
+              <w:t>El Operador EW debe detener la alimentacion ante desviaciones del circuito.</w:t>
+            </w:r>
+          </w:p>
+        </w:tc>
+        <w:tc>
+          <w:tcPr>
+            <w:tcW w:type="dxa" w:w="2160"/>
+          </w:tcPr>
+          <w:p>
+            <w:r>
+              <w:t>Descriptor EW preservado.</w:t>
+            </w:r>
+          </w:p>
+        </w:tc>
+      </w:tr>
+      <w:tr>
+        <w:tc>
+          <w:tcPr>
+            <w:tcW w:type="dxa" w:w="2160"/>
+          </w:tcPr>
+          <w:p>
+            <w:r>
+              <w:t>Tabla de EW</w:t>
+            </w:r>
+          </w:p>
+        </w:tc>
+        <w:tc>
+          <w:tcPr>
+            <w:tcW w:type="dxa" w:w="2160"/>
+          </w:tcPr>
+          <w:p>
+            <w:r>
+              <w:t>Operador de EW</w:t>
+            </w:r>
+          </w:p>
+        </w:tc>
+        <w:tc>
+          <w:tcPr>
+            <w:tcW w:type="dxa" w:w="2160"/>
+          </w:tcPr>
+          <w:p>
+            <w:r>
+              <w:t>El Operador de EW debe comunicar la condicion al supervisor de turno.</w:t>
+            </w:r>
+          </w:p>
+        </w:tc>
+        <w:tc>
+          <w:tcPr>
+            <w:tcW w:type="dxa" w:w="2160"/>
+          </w:tcPr>
+          <w:p>
+            <w:r>
+              <w:t>Descriptor de EW preservado.</w:t>
+            </w:r>
+          </w:p>
+        </w:tc>
+      </w:tr>
+      <w:tr>
+        <w:tc>
+          <w:tcPr>
+            <w:tcW w:type="dxa" w:w="2160"/>
+          </w:tcPr>
+          <w:p>
+            <w:r>
+              <w:t>Tabla MLDC</w:t>
+            </w:r>
+          </w:p>
+        </w:tc>
+        <w:tc>
+          <w:tcPr>
+            <w:tcW w:type="dxa" w:w="2160"/>
+          </w:tcPr>
+          <w:p>
+            <w:r>
+              <w:t>Operador MLDC</w:t>
+            </w:r>
+          </w:p>
+        </w:tc>
+        <w:tc>
+          <w:tcPr>
+            <w:tcW w:type="dxa" w:w="2160"/>
+          </w:tcPr>
+          <w:p>
+            <w:r>
+              <w:t>El Operador MLDC debe revisar la secuencia de arranque.</w:t>
+            </w:r>
+          </w:p>
+        </w:tc>
+        <w:tc>
+          <w:tcPr>
+            <w:tcW w:type="dxa" w:w="2160"/>
+          </w:tcPr>
+          <w:p>
+            <w:r>
+              <w:t>Descriptor MLDC preservado.</w:t>
+            </w:r>
+          </w:p>
+        </w:tc>
+      </w:tr>
+      <w:tr>
+        <w:tc>
+          <w:tcPr>
+            <w:tcW w:type="dxa" w:w="2160"/>
+          </w:tcPr>
+          <w:p>
+            <w:r>
+              <w:t>Tabla maquina despegadora</w:t>
+            </w:r>
+          </w:p>
+        </w:tc>
+        <w:tc>
+          <w:tcPr>
+            <w:tcW w:type="dxa" w:w="2160"/>
+          </w:tcPr>
+          <w:p>
+            <w:r>
+              <w:t>Operador de la maquina despegadora</w:t>
+            </w:r>
+          </w:p>
+        </w:tc>
+        <w:tc>
+          <w:tcPr>
+            <w:tcW w:type="dxa" w:w="2160"/>
+          </w:tcPr>
+          <w:p>
+            <w:r>
+              <w:t>El Operador de la maquina despegadora debe detener el equipo ante una alarma.</w:t>
+            </w:r>
+          </w:p>
+        </w:tc>
+        <w:tc>
+          <w:tcPr>
+            <w:tcW w:type="dxa" w:w="2160"/>
+          </w:tcPr>
+          <w:p>
+            <w:r>
+              <w:t>Descriptor maquina despegadora preservado.</w:t>
+            </w:r>
+          </w:p>
+        </w:tc>
+      </w:tr>
+      <w:tr>
+        <w:tc>
+          <w:tcPr>
+            <w:tcW w:type="dxa" w:w="2160"/>
+          </w:tcPr>
+          <w:p>
+            <w:r>
+              <w:t>Tabla puente grua encargado</w:t>
+            </w:r>
+          </w:p>
+        </w:tc>
+        <w:tc>
+          <w:tcPr>
+            <w:tcW w:type="dxa" w:w="2160"/>
+          </w:tcPr>
+          <w:p>
+            <w:r>
+              <w:t>operador encargado del puente grua</w:t>
+            </w:r>
+          </w:p>
+        </w:tc>
+        <w:tc>
+          <w:tcPr>
+            <w:tcW w:type="dxa" w:w="2160"/>
+          </w:tcPr>
+          <w:p>
+            <w:r>
+              <w:t>El operador encargado del puente grua debe revisar el area de izaje antes de operar.</w:t>
+            </w:r>
+          </w:p>
+        </w:tc>
+        <w:tc>
+          <w:tcPr>
+            <w:tcW w:type="dxa" w:w="2160"/>
+          </w:tcPr>
+          <w:p>
+            <w:r>
+              <w:t>Descriptor encargado preservado.</w:t>
+            </w:r>
+          </w:p>
+        </w:tc>
+      </w:tr>
+      <w:tr>
+        <w:tc>
+          <w:tcPr>
+            <w:tcW w:type="dxa" w:w="2160"/>
+          </w:tcPr>
+          <w:p>
+            <w:r>
+              <w:t>Tabla malformado Spence</w:t>
+            </w:r>
+          </w:p>
+        </w:tc>
+        <w:tc>
+          <w:tcPr>
+            <w:tcW w:type="dxa" w:w="2160"/>
+          </w:tcPr>
+          <w:p>
+            <w:r>
+              <w:t>operador o personal designado por minera Spence Spence</w:t>
+            </w:r>
+          </w:p>
+        </w:tc>
+        <w:tc>
+          <w:tcPr>
+            <w:tcW w:type="dxa" w:w="2160"/>
+          </w:tcPr>
+          <w:p>
+            <w:r>
+              <w:t>El operador o personal designado por minera Spence Spence debe revisar la lista operacional.</w:t>
+            </w:r>
+          </w:p>
+        </w:tc>
+        <w:tc>
+          <w:tcPr>
+            <w:tcW w:type="dxa" w:w="2160"/>
+          </w:tcPr>
+          <w:p>
+            <w:r>
+              <w:t>Debe reparar Spence duplicado.</w:t>
+            </w:r>
+          </w:p>
+        </w:tc>
+      </w:tr>
+      <w:tr>
+        <w:tc>
+          <w:tcPr>
+            <w:tcW w:type="dxa" w:w="2160"/>
+          </w:tcPr>
+          <w:p>
+            <w:r>
+              <w:t>Tabla malformado catodos</w:t>
+            </w:r>
+          </w:p>
+        </w:tc>
+        <w:tc>
+          <w:tcPr>
+            <w:tcW w:type="dxa" w:w="2160"/>
+          </w:tcPr>
+          <w:p>
+            <w:r>
+              <w:t>operador de patio o personal designado por minera Spence de catodos</w:t>
+            </w:r>
+          </w:p>
+        </w:tc>
+        <w:tc>
+          <w:tcPr>
+            <w:tcW w:type="dxa" w:w="2160"/>
+          </w:tcPr>
+          <w:p>
+            <w:r>
+              <w:t>El operador de patio o personal designado por minera Spence de catodos debe liberar el sector.</w:t>
+            </w:r>
+          </w:p>
+        </w:tc>
+        <w:tc>
+          <w:tcPr>
+            <w:tcW w:type="dxa" w:w="2160"/>
+          </w:tcPr>
+          <w:p>
+            <w:r>
+              <w:t>Debe mover de catodos antes del target.</w:t>
+            </w:r>
+          </w:p>
+        </w:tc>
+      </w:tr>
+      <w:tr>
+        <w:tc>
+          <w:tcPr>
+            <w:tcW w:type="dxa" w:w="2160"/>
+          </w:tcPr>
+          <w:p>
+            <w:r>
               <w:t>Caso supervisor ya expandido</w:t>
             </w:r>
           </w:p>

</xml_diff>